<commit_message>
Redesign fraction division worksheet: black and white, larger font
White background, black borders, grey-shaded fraction bars, 14pt base
text, and roomier answer areas (three printable pages). The teacher key
is also black and white and still one page. Preview page, downloads and
corner card updated.

Co-Authored-By: Claude Sonnet 5.5 <noreply@anthropic.com>
</commit_message>
<xml_diff>
--- a/math6/files/fraction-division-worksheet-key.docx
+++ b/math6/files/fraction-division-worksheet-key.docx
@@ -24,17 +24,16 @@
           <w:tcPr>
             <w:tcW w:type="dxa" w:w="10206"/>
             <w:tcBorders>
-              <w:top w:val="none" w:color="FFFFFF" w:sz="0"/>
-              <w:left w:val="none" w:color="FFFFFF" w:sz="0"/>
-              <w:bottom w:val="none" w:color="FFFFFF" w:sz="0"/>
-              <w:right w:val="none" w:color="FFFFFF" w:sz="0"/>
+              <w:top w:val="single" w:color="000000" w:sz="30"/>
+              <w:left w:val="single" w:color="000000" w:sz="30"/>
+              <w:bottom w:val="single" w:color="000000" w:sz="30"/>
+              <w:right w:val="single" w:color="000000" w:sz="30"/>
             </w:tcBorders>
-            <w:shd w:fill="141B40" w:color="auto" w:val="clear"/>
             <w:tcMar>
-              <w:top w:type="dxa" w:w="110"/>
-              <w:left w:type="dxa" w:w="280"/>
-              <w:bottom w:type="dxa" w:w="110"/>
-              <w:right w:type="dxa" w:w="280"/>
+              <w:top w:type="dxa" w:w="100"/>
+              <w:left w:type="dxa" w:w="260"/>
+              <w:bottom w:type="dxa" w:w="100"/>
+              <w:right w:type="dxa" w:w="260"/>
             </w:tcMar>
           </w:tcPr>
           <w:p>
@@ -48,7 +47,7 @@
                 <w:rFonts w:ascii="Arial" w:cs="Arial" w:hAnsi="Arial"/>
                 <w:b/>
                 <w:bCs/>
-                <w:color w:val="FFC93C"/>
+                <w:color w:val="000000"/>
                 <w:sz w:val="44"/>
                 <w:szCs w:val="44"/>
                 <w:rtl/>
@@ -67,9 +66,9 @@
                 <w:rFonts w:ascii="Arial" w:cs="Arial" w:hAnsi="Arial"/>
                 <w:b w:val="false"/>
                 <w:bCs w:val="false"/>
-                <w:color w:val="FFFFFF"/>
-                <w:sz w:val="22"/>
-                <w:szCs w:val="22"/>
+                <w:color w:val="000000"/>
+                <w:sz w:val="24"/>
+                <w:szCs w:val="24"/>
                 <w:rtl/>
               </w:rPr>
               <w:t xml:space="preserve">ورقة عمل «مختبر العصائر» — قسمة الكسور عندما يكون أحد العددين عددًا صحيحًا</w:t>
@@ -82,16 +81,16 @@
       <w:pPr>
         <w:keepNext/>
         <w:bidi/>
-        <w:spacing w:after="30" w:before="70"/>
+        <w:spacing w:after="20" w:before="60"/>
       </w:pPr>
       <w:r>
         <w:rPr>
           <w:rFonts w:ascii="Arial" w:cs="Arial" w:hAnsi="Arial"/>
           <w:b/>
           <w:bCs/>
-          <w:color w:val="4C5FD5"/>
-          <w:sz w:val="26"/>
-          <w:szCs w:val="26"/>
+          <w:color w:val="000000"/>
+          <w:sz w:val="28"/>
+          <w:szCs w:val="28"/>
           <w:rtl/>
         </w:rPr>
         <w:t xml:space="preserve">1) نوزّع بالتساوي</w:t>
@@ -122,16 +121,15 @@
           <w:tcPr>
             <w:tcW w:type="dxa" w:w="10206"/>
             <w:tcBorders>
-              <w:top w:val="single" w:color="FFFFFF" w:sz="18"/>
+              <w:top w:val="none" w:color="FFFFFF" w:sz="0"/>
               <w:left w:val="none" w:color="FFFFFF" w:sz="0"/>
-              <w:bottom w:val="single" w:color="FFFFFF" w:sz="24"/>
+              <w:bottom w:val="single" w:color="BBBBBB" w:sz="4"/>
               <w:right w:val="none" w:color="FFFFFF" w:sz="0"/>
             </w:tcBorders>
-            <w:shd w:fill="F4F6FF" w:color="auto" w:val="clear"/>
             <w:tcMar>
-              <w:top w:type="dxa" w:w="40"/>
+              <w:top w:type="dxa" w:w="30"/>
               <w:left w:type="dxa" w:w="200"/>
-              <w:bottom w:type="dxa" w:w="40"/>
+              <w:bottom w:type="dxa" w:w="30"/>
               <w:right w:type="dxa" w:w="200"/>
             </w:tcMar>
           </w:tcPr>
@@ -145,9 +143,9 @@
                 <w:rFonts w:ascii="Arial" w:cs="Arial" w:hAnsi="Arial"/>
                 <w:b/>
                 <w:bCs/>
-                <w:color w:val="4C5FD5"/>
-                <w:sz w:val="23"/>
-                <w:szCs w:val="23"/>
+                <w:color w:val="000000"/>
+                <w:sz w:val="22"/>
+                <w:szCs w:val="22"/>
                 <w:rtl/>
               </w:rPr>
               <w:t xml:space="preserve">1:  </w:t>
@@ -201,7 +199,7 @@
                 <w:rFonts w:ascii="Arial" w:cs="Arial" w:hAnsi="Arial"/>
                 <w:b w:val="false"/>
                 <w:bCs w:val="false"/>
-                <w:color w:val="1B1F3B"/>
+                <w:color w:val="000000"/>
                 <w:sz w:val="22"/>
                 <w:szCs w:val="22"/>
                 <w:rtl/>
@@ -219,16 +217,15 @@
           <w:tcPr>
             <w:tcW w:type="dxa" w:w="10206"/>
             <w:tcBorders>
-              <w:top w:val="single" w:color="FFFFFF" w:sz="18"/>
+              <w:top w:val="none" w:color="FFFFFF" w:sz="0"/>
               <w:left w:val="none" w:color="FFFFFF" w:sz="0"/>
-              <w:bottom w:val="single" w:color="FFFFFF" w:sz="24"/>
+              <w:bottom w:val="single" w:color="BBBBBB" w:sz="4"/>
               <w:right w:val="none" w:color="FFFFFF" w:sz="0"/>
             </w:tcBorders>
-            <w:shd w:fill="F4F6FF" w:color="auto" w:val="clear"/>
             <w:tcMar>
-              <w:top w:type="dxa" w:w="40"/>
+              <w:top w:type="dxa" w:w="30"/>
               <w:left w:type="dxa" w:w="200"/>
-              <w:bottom w:type="dxa" w:w="40"/>
+              <w:bottom w:type="dxa" w:w="30"/>
               <w:right w:type="dxa" w:w="200"/>
             </w:tcMar>
           </w:tcPr>
@@ -242,9 +239,9 @@
                 <w:rFonts w:ascii="Arial" w:cs="Arial" w:hAnsi="Arial"/>
                 <w:b/>
                 <w:bCs/>
-                <w:color w:val="4C5FD5"/>
-                <w:sz w:val="23"/>
-                <w:szCs w:val="23"/>
+                <w:color w:val="000000"/>
+                <w:sz w:val="22"/>
+                <w:szCs w:val="22"/>
                 <w:rtl/>
               </w:rPr>
               <w:t xml:space="preserve">2:  </w:t>
@@ -283,7 +280,7 @@
                 <w:rFonts w:ascii="Arial" w:cs="Arial" w:hAnsi="Arial"/>
                 <w:b w:val="false"/>
                 <w:bCs w:val="false"/>
-                <w:color w:val="1B1F3B"/>
+                <w:color w:val="000000"/>
                 <w:sz w:val="22"/>
                 <w:szCs w:val="22"/>
                 <w:rtl/>
@@ -301,16 +298,15 @@
           <w:tcPr>
             <w:tcW w:type="dxa" w:w="10206"/>
             <w:tcBorders>
-              <w:top w:val="single" w:color="FFFFFF" w:sz="18"/>
+              <w:top w:val="none" w:color="FFFFFF" w:sz="0"/>
               <w:left w:val="none" w:color="FFFFFF" w:sz="0"/>
-              <w:bottom w:val="single" w:color="FFFFFF" w:sz="24"/>
+              <w:bottom w:val="single" w:color="BBBBBB" w:sz="4"/>
               <w:right w:val="none" w:color="FFFFFF" w:sz="0"/>
             </w:tcBorders>
-            <w:shd w:fill="F4F6FF" w:color="auto" w:val="clear"/>
             <w:tcMar>
-              <w:top w:type="dxa" w:w="40"/>
+              <w:top w:type="dxa" w:w="30"/>
               <w:left w:type="dxa" w:w="200"/>
-              <w:bottom w:type="dxa" w:w="40"/>
+              <w:bottom w:type="dxa" w:w="30"/>
               <w:right w:type="dxa" w:w="200"/>
             </w:tcMar>
           </w:tcPr>
@@ -324,9 +320,9 @@
                 <w:rFonts w:ascii="Arial" w:cs="Arial" w:hAnsi="Arial"/>
                 <w:b/>
                 <w:bCs/>
-                <w:color w:val="4C5FD5"/>
-                <w:sz w:val="23"/>
-                <w:szCs w:val="23"/>
+                <w:color w:val="000000"/>
+                <w:sz w:val="22"/>
+                <w:szCs w:val="22"/>
                 <w:rtl/>
               </w:rPr>
               <w:t xml:space="preserve">3:  </w:t>
@@ -380,7 +376,7 @@
                 <w:rFonts w:ascii="Arial" w:cs="Arial" w:hAnsi="Arial"/>
                 <w:b w:val="false"/>
                 <w:bCs w:val="false"/>
-                <w:color w:val="1B1F3B"/>
+                <w:color w:val="000000"/>
                 <w:sz w:val="22"/>
                 <w:szCs w:val="22"/>
                 <w:rtl/>
@@ -398,16 +394,15 @@
           <w:tcPr>
             <w:tcW w:type="dxa" w:w="10206"/>
             <w:tcBorders>
-              <w:top w:val="single" w:color="FFFFFF" w:sz="18"/>
+              <w:top w:val="none" w:color="FFFFFF" w:sz="0"/>
               <w:left w:val="none" w:color="FFFFFF" w:sz="0"/>
-              <w:bottom w:val="single" w:color="FFFFFF" w:sz="24"/>
+              <w:bottom w:val="single" w:color="BBBBBB" w:sz="4"/>
               <w:right w:val="none" w:color="FFFFFF" w:sz="0"/>
             </w:tcBorders>
-            <w:shd w:fill="F4F6FF" w:color="auto" w:val="clear"/>
             <w:tcMar>
-              <w:top w:type="dxa" w:w="40"/>
+              <w:top w:type="dxa" w:w="30"/>
               <w:left w:type="dxa" w:w="200"/>
-              <w:bottom w:type="dxa" w:w="40"/>
+              <w:bottom w:type="dxa" w:w="30"/>
               <w:right w:type="dxa" w:w="200"/>
             </w:tcMar>
           </w:tcPr>
@@ -421,9 +416,9 @@
                 <w:rFonts w:ascii="Arial" w:cs="Arial" w:hAnsi="Arial"/>
                 <w:b/>
                 <w:bCs/>
-                <w:color w:val="4C5FD5"/>
-                <w:sz w:val="23"/>
-                <w:szCs w:val="23"/>
+                <w:color w:val="000000"/>
+                <w:sz w:val="22"/>
+                <w:szCs w:val="22"/>
                 <w:rtl/>
               </w:rPr>
               <w:t xml:space="preserve">4:  </w:t>
@@ -462,7 +457,7 @@
                 <w:rFonts w:ascii="Arial" w:cs="Arial" w:hAnsi="Arial"/>
                 <w:b w:val="false"/>
                 <w:bCs w:val="false"/>
-                <w:color w:val="1B1F3B"/>
+                <w:color w:val="000000"/>
                 <w:sz w:val="22"/>
                 <w:szCs w:val="22"/>
                 <w:rtl/>
@@ -477,16 +472,16 @@
       <w:pPr>
         <w:keepNext/>
         <w:bidi/>
-        <w:spacing w:after="30" w:before="70"/>
+        <w:spacing w:after="20" w:before="60"/>
       </w:pPr>
       <w:r>
         <w:rPr>
           <w:rFonts w:ascii="Arial" w:cs="Arial" w:hAnsi="Arial"/>
           <w:b/>
           <w:bCs/>
-          <w:color w:val="E8700A"/>
-          <w:sz w:val="26"/>
-          <w:szCs w:val="26"/>
+          <w:color w:val="000000"/>
+          <w:sz w:val="28"/>
+          <w:szCs w:val="28"/>
           <w:rtl/>
         </w:rPr>
         <w:t xml:space="preserve">2) كم كوبًا نملأ؟</w:t>
@@ -517,16 +512,15 @@
           <w:tcPr>
             <w:tcW w:type="dxa" w:w="10206"/>
             <w:tcBorders>
-              <w:top w:val="single" w:color="FFFFFF" w:sz="18"/>
+              <w:top w:val="none" w:color="FFFFFF" w:sz="0"/>
               <w:left w:val="none" w:color="FFFFFF" w:sz="0"/>
-              <w:bottom w:val="single" w:color="FFFFFF" w:sz="24"/>
+              <w:bottom w:val="single" w:color="BBBBBB" w:sz="4"/>
               <w:right w:val="none" w:color="FFFFFF" w:sz="0"/>
             </w:tcBorders>
-            <w:shd w:fill="F4F6FF" w:color="auto" w:val="clear"/>
             <w:tcMar>
-              <w:top w:type="dxa" w:w="40"/>
+              <w:top w:type="dxa" w:w="30"/>
               <w:left w:type="dxa" w:w="200"/>
-              <w:bottom w:type="dxa" w:w="40"/>
+              <w:bottom w:type="dxa" w:w="30"/>
               <w:right w:type="dxa" w:w="200"/>
             </w:tcMar>
           </w:tcPr>
@@ -540,9 +534,9 @@
                 <w:rFonts w:ascii="Arial" w:cs="Arial" w:hAnsi="Arial"/>
                 <w:b/>
                 <w:bCs/>
-                <w:color w:val="4C5FD5"/>
-                <w:sz w:val="23"/>
-                <w:szCs w:val="23"/>
+                <w:color w:val="000000"/>
+                <w:sz w:val="22"/>
+                <w:szCs w:val="22"/>
                 <w:rtl/>
               </w:rPr>
               <w:t xml:space="preserve">1:  </w:t>
@@ -572,7 +566,7 @@
                 <w:rFonts w:ascii="Arial" w:cs="Arial" w:hAnsi="Arial"/>
                 <w:b w:val="false"/>
                 <w:bCs w:val="false"/>
-                <w:color w:val="1B1F3B"/>
+                <w:color w:val="000000"/>
                 <w:sz w:val="22"/>
                 <w:szCs w:val="22"/>
                 <w:rtl/>
@@ -590,16 +584,15 @@
           <w:tcPr>
             <w:tcW w:type="dxa" w:w="10206"/>
             <w:tcBorders>
-              <w:top w:val="single" w:color="FFFFFF" w:sz="18"/>
+              <w:top w:val="none" w:color="FFFFFF" w:sz="0"/>
               <w:left w:val="none" w:color="FFFFFF" w:sz="0"/>
-              <w:bottom w:val="single" w:color="FFFFFF" w:sz="24"/>
+              <w:bottom w:val="single" w:color="BBBBBB" w:sz="4"/>
               <w:right w:val="none" w:color="FFFFFF" w:sz="0"/>
             </w:tcBorders>
-            <w:shd w:fill="F4F6FF" w:color="auto" w:val="clear"/>
             <w:tcMar>
-              <w:top w:type="dxa" w:w="40"/>
+              <w:top w:type="dxa" w:w="30"/>
               <w:left w:type="dxa" w:w="200"/>
-              <w:bottom w:type="dxa" w:w="40"/>
+              <w:bottom w:type="dxa" w:w="30"/>
               <w:right w:type="dxa" w:w="200"/>
             </w:tcMar>
           </w:tcPr>
@@ -613,9 +606,9 @@
                 <w:rFonts w:ascii="Arial" w:cs="Arial" w:hAnsi="Arial"/>
                 <w:b/>
                 <w:bCs/>
-                <w:color w:val="4C5FD5"/>
-                <w:sz w:val="23"/>
-                <w:szCs w:val="23"/>
+                <w:color w:val="000000"/>
+                <w:sz w:val="22"/>
+                <w:szCs w:val="22"/>
                 <w:rtl/>
               </w:rPr>
               <w:t xml:space="preserve">2:  </w:t>
@@ -645,7 +638,7 @@
                 <w:rFonts w:ascii="Arial" w:cs="Arial" w:hAnsi="Arial"/>
                 <w:b w:val="false"/>
                 <w:bCs w:val="false"/>
-                <w:color w:val="1B1F3B"/>
+                <w:color w:val="000000"/>
                 <w:sz w:val="22"/>
                 <w:szCs w:val="22"/>
                 <w:rtl/>
@@ -663,16 +656,15 @@
           <w:tcPr>
             <w:tcW w:type="dxa" w:w="10206"/>
             <w:tcBorders>
-              <w:top w:val="single" w:color="FFFFFF" w:sz="18"/>
+              <w:top w:val="none" w:color="FFFFFF" w:sz="0"/>
               <w:left w:val="none" w:color="FFFFFF" w:sz="0"/>
-              <w:bottom w:val="single" w:color="FFFFFF" w:sz="24"/>
+              <w:bottom w:val="single" w:color="BBBBBB" w:sz="4"/>
               <w:right w:val="none" w:color="FFFFFF" w:sz="0"/>
             </w:tcBorders>
-            <w:shd w:fill="F4F6FF" w:color="auto" w:val="clear"/>
             <w:tcMar>
-              <w:top w:type="dxa" w:w="40"/>
+              <w:top w:type="dxa" w:w="30"/>
               <w:left w:type="dxa" w:w="200"/>
-              <w:bottom w:type="dxa" w:w="40"/>
+              <w:bottom w:type="dxa" w:w="30"/>
               <w:right w:type="dxa" w:w="200"/>
             </w:tcMar>
           </w:tcPr>
@@ -686,9 +678,9 @@
                 <w:rFonts w:ascii="Arial" w:cs="Arial" w:hAnsi="Arial"/>
                 <w:b/>
                 <w:bCs/>
-                <w:color w:val="4C5FD5"/>
-                <w:sz w:val="23"/>
-                <w:szCs w:val="23"/>
+                <w:color w:val="000000"/>
+                <w:sz w:val="22"/>
+                <w:szCs w:val="22"/>
                 <w:rtl/>
               </w:rPr>
               <w:t xml:space="preserve">3:  </w:t>
@@ -718,7 +710,7 @@
                 <w:rFonts w:ascii="Arial" w:cs="Arial" w:hAnsi="Arial"/>
                 <w:b w:val="false"/>
                 <w:bCs w:val="false"/>
-                <w:color w:val="1B1F3B"/>
+                <w:color w:val="000000"/>
                 <w:sz w:val="22"/>
                 <w:szCs w:val="22"/>
                 <w:rtl/>
@@ -736,16 +728,15 @@
           <w:tcPr>
             <w:tcW w:type="dxa" w:w="10206"/>
             <w:tcBorders>
-              <w:top w:val="single" w:color="FFFFFF" w:sz="18"/>
+              <w:top w:val="none" w:color="FFFFFF" w:sz="0"/>
               <w:left w:val="none" w:color="FFFFFF" w:sz="0"/>
-              <w:bottom w:val="single" w:color="FFFFFF" w:sz="24"/>
+              <w:bottom w:val="single" w:color="BBBBBB" w:sz="4"/>
               <w:right w:val="none" w:color="FFFFFF" w:sz="0"/>
             </w:tcBorders>
-            <w:shd w:fill="F4F6FF" w:color="auto" w:val="clear"/>
             <w:tcMar>
-              <w:top w:type="dxa" w:w="40"/>
+              <w:top w:type="dxa" w:w="30"/>
               <w:left w:type="dxa" w:w="200"/>
-              <w:bottom w:type="dxa" w:w="40"/>
+              <w:bottom w:type="dxa" w:w="30"/>
               <w:right w:type="dxa" w:w="200"/>
             </w:tcMar>
           </w:tcPr>
@@ -759,9 +750,9 @@
                 <w:rFonts w:ascii="Arial" w:cs="Arial" w:hAnsi="Arial"/>
                 <w:b/>
                 <w:bCs/>
-                <w:color w:val="4C5FD5"/>
-                <w:sz w:val="23"/>
-                <w:szCs w:val="23"/>
+                <w:color w:val="000000"/>
+                <w:sz w:val="22"/>
+                <w:szCs w:val="22"/>
                 <w:rtl/>
               </w:rPr>
               <w:t xml:space="preserve">4:  </w:t>
@@ -791,7 +782,7 @@
                 <w:rFonts w:ascii="Arial" w:cs="Arial" w:hAnsi="Arial"/>
                 <w:b w:val="false"/>
                 <w:bCs w:val="false"/>
-                <w:color w:val="1B1F3B"/>
+                <w:color w:val="000000"/>
                 <w:sz w:val="22"/>
                 <w:szCs w:val="22"/>
                 <w:rtl/>
@@ -806,16 +797,16 @@
       <w:pPr>
         <w:keepNext/>
         <w:bidi/>
-        <w:spacing w:after="30" w:before="70"/>
+        <w:spacing w:after="20" w:before="60"/>
       </w:pPr>
       <w:r>
         <w:rPr>
           <w:rFonts w:ascii="Arial" w:cs="Arial" w:hAnsi="Arial"/>
           <w:b/>
           <w:bCs/>
-          <w:color w:val="0F9B8E"/>
-          <w:sz w:val="26"/>
-          <w:szCs w:val="26"/>
+          <w:color w:val="000000"/>
+          <w:sz w:val="28"/>
+          <w:szCs w:val="28"/>
           <w:rtl/>
         </w:rPr>
         <w:t xml:space="preserve">3) نختزل ونتحقّق بالضرب</w:t>
@@ -846,16 +837,15 @@
           <w:tcPr>
             <w:tcW w:type="dxa" w:w="10206"/>
             <w:tcBorders>
-              <w:top w:val="single" w:color="FFFFFF" w:sz="18"/>
+              <w:top w:val="none" w:color="FFFFFF" w:sz="0"/>
               <w:left w:val="none" w:color="FFFFFF" w:sz="0"/>
-              <w:bottom w:val="single" w:color="FFFFFF" w:sz="24"/>
+              <w:bottom w:val="single" w:color="BBBBBB" w:sz="4"/>
               <w:right w:val="none" w:color="FFFFFF" w:sz="0"/>
             </w:tcBorders>
-            <w:shd w:fill="F4F6FF" w:color="auto" w:val="clear"/>
             <w:tcMar>
-              <w:top w:type="dxa" w:w="40"/>
+              <w:top w:type="dxa" w:w="30"/>
               <w:left w:type="dxa" w:w="200"/>
-              <w:bottom w:type="dxa" w:w="40"/>
+              <w:bottom w:type="dxa" w:w="30"/>
               <w:right w:type="dxa" w:w="200"/>
             </w:tcMar>
           </w:tcPr>
@@ -869,9 +859,9 @@
                 <w:rFonts w:ascii="Arial" w:cs="Arial" w:hAnsi="Arial"/>
                 <w:b/>
                 <w:bCs/>
-                <w:color w:val="4C5FD5"/>
-                <w:sz w:val="23"/>
-                <w:szCs w:val="23"/>
+                <w:color w:val="000000"/>
+                <w:sz w:val="22"/>
+                <w:szCs w:val="22"/>
                 <w:rtl/>
               </w:rPr>
               <w:t xml:space="preserve">1:  </w:t>
@@ -910,7 +900,7 @@
                 <w:rFonts w:ascii="Arial" w:cs="Arial" w:hAnsi="Arial"/>
                 <w:b w:val="false"/>
                 <w:bCs w:val="false"/>
-                <w:color w:val="1B1F3B"/>
+                <w:color w:val="000000"/>
                 <w:sz w:val="22"/>
                 <w:szCs w:val="22"/>
                 <w:rtl/>
@@ -972,16 +962,15 @@
           <w:tcPr>
             <w:tcW w:type="dxa" w:w="10206"/>
             <w:tcBorders>
-              <w:top w:val="single" w:color="FFFFFF" w:sz="18"/>
+              <w:top w:val="none" w:color="FFFFFF" w:sz="0"/>
               <w:left w:val="none" w:color="FFFFFF" w:sz="0"/>
-              <w:bottom w:val="single" w:color="FFFFFF" w:sz="24"/>
+              <w:bottom w:val="single" w:color="BBBBBB" w:sz="4"/>
               <w:right w:val="none" w:color="FFFFFF" w:sz="0"/>
             </w:tcBorders>
-            <w:shd w:fill="F4F6FF" w:color="auto" w:val="clear"/>
             <w:tcMar>
-              <w:top w:type="dxa" w:w="40"/>
+              <w:top w:type="dxa" w:w="30"/>
               <w:left w:type="dxa" w:w="200"/>
-              <w:bottom w:type="dxa" w:w="40"/>
+              <w:bottom w:type="dxa" w:w="30"/>
               <w:right w:type="dxa" w:w="200"/>
             </w:tcMar>
           </w:tcPr>
@@ -995,9 +984,9 @@
                 <w:rFonts w:ascii="Arial" w:cs="Arial" w:hAnsi="Arial"/>
                 <w:b/>
                 <w:bCs/>
-                <w:color w:val="4C5FD5"/>
-                <w:sz w:val="23"/>
-                <w:szCs w:val="23"/>
+                <w:color w:val="000000"/>
+                <w:sz w:val="22"/>
+                <w:szCs w:val="22"/>
                 <w:rtl/>
               </w:rPr>
               <w:t xml:space="preserve">2:  </w:t>
@@ -1051,7 +1040,7 @@
                 <w:rFonts w:ascii="Arial" w:cs="Arial" w:hAnsi="Arial"/>
                 <w:b w:val="false"/>
                 <w:bCs w:val="false"/>
-                <w:color w:val="1B1F3B"/>
+                <w:color w:val="000000"/>
                 <w:sz w:val="22"/>
                 <w:szCs w:val="22"/>
                 <w:rtl/>
@@ -1098,16 +1087,15 @@
           <w:tcPr>
             <w:tcW w:type="dxa" w:w="10206"/>
             <w:tcBorders>
-              <w:top w:val="single" w:color="FFFFFF" w:sz="18"/>
+              <w:top w:val="none" w:color="FFFFFF" w:sz="0"/>
               <w:left w:val="none" w:color="FFFFFF" w:sz="0"/>
-              <w:bottom w:val="single" w:color="FFFFFF" w:sz="24"/>
+              <w:bottom w:val="single" w:color="BBBBBB" w:sz="4"/>
               <w:right w:val="none" w:color="FFFFFF" w:sz="0"/>
             </w:tcBorders>
-            <w:shd w:fill="F4F6FF" w:color="auto" w:val="clear"/>
             <w:tcMar>
-              <w:top w:type="dxa" w:w="40"/>
+              <w:top w:type="dxa" w:w="30"/>
               <w:left w:type="dxa" w:w="200"/>
-              <w:bottom w:type="dxa" w:w="40"/>
+              <w:bottom w:type="dxa" w:w="30"/>
               <w:right w:type="dxa" w:w="200"/>
             </w:tcMar>
           </w:tcPr>
@@ -1121,9 +1109,9 @@
                 <w:rFonts w:ascii="Arial" w:cs="Arial" w:hAnsi="Arial"/>
                 <w:b/>
                 <w:bCs/>
-                <w:color w:val="4C5FD5"/>
-                <w:sz w:val="23"/>
-                <w:szCs w:val="23"/>
+                <w:color w:val="000000"/>
+                <w:sz w:val="22"/>
+                <w:szCs w:val="22"/>
                 <w:rtl/>
               </w:rPr>
               <w:t xml:space="preserve">3:  </w:t>
@@ -1177,7 +1165,7 @@
                 <w:rFonts w:ascii="Arial" w:cs="Arial" w:hAnsi="Arial"/>
                 <w:b w:val="false"/>
                 <w:bCs w:val="false"/>
-                <w:color w:val="1B1F3B"/>
+                <w:color w:val="000000"/>
                 <w:sz w:val="22"/>
                 <w:szCs w:val="22"/>
                 <w:rtl/>
@@ -1224,16 +1212,15 @@
           <w:tcPr>
             <w:tcW w:type="dxa" w:w="10206"/>
             <w:tcBorders>
-              <w:top w:val="single" w:color="FFFFFF" w:sz="18"/>
+              <w:top w:val="none" w:color="FFFFFF" w:sz="0"/>
               <w:left w:val="none" w:color="FFFFFF" w:sz="0"/>
-              <w:bottom w:val="single" w:color="FFFFFF" w:sz="24"/>
+              <w:bottom w:val="single" w:color="BBBBBB" w:sz="4"/>
               <w:right w:val="none" w:color="FFFFFF" w:sz="0"/>
             </w:tcBorders>
-            <w:shd w:fill="F4F6FF" w:color="auto" w:val="clear"/>
             <w:tcMar>
-              <w:top w:type="dxa" w:w="40"/>
+              <w:top w:type="dxa" w:w="30"/>
               <w:left w:type="dxa" w:w="200"/>
-              <w:bottom w:type="dxa" w:w="40"/>
+              <w:bottom w:type="dxa" w:w="30"/>
               <w:right w:type="dxa" w:w="200"/>
             </w:tcMar>
           </w:tcPr>
@@ -1247,9 +1234,9 @@
                 <w:rFonts w:ascii="Arial" w:cs="Arial" w:hAnsi="Arial"/>
                 <w:b/>
                 <w:bCs/>
-                <w:color w:val="4C5FD5"/>
-                <w:sz w:val="23"/>
-                <w:szCs w:val="23"/>
+                <w:color w:val="000000"/>
+                <w:sz w:val="22"/>
+                <w:szCs w:val="22"/>
                 <w:rtl/>
               </w:rPr>
               <w:t xml:space="preserve">4:  </w:t>
@@ -1303,7 +1290,7 @@
                 <w:rFonts w:ascii="Arial" w:cs="Arial" w:hAnsi="Arial"/>
                 <w:b w:val="false"/>
                 <w:bCs w:val="false"/>
-                <w:color w:val="1B1F3B"/>
+                <w:color w:val="000000"/>
                 <w:sz w:val="22"/>
                 <w:szCs w:val="22"/>
                 <w:rtl/>
@@ -1362,16 +1349,16 @@
       <w:pPr>
         <w:keepNext/>
         <w:bidi/>
-        <w:spacing w:after="30" w:before="70"/>
+        <w:spacing w:after="20" w:before="60"/>
       </w:pPr>
       <w:r>
         <w:rPr>
           <w:rFonts w:ascii="Arial" w:cs="Arial" w:hAnsi="Arial"/>
           <w:b/>
           <w:bCs/>
-          <w:color w:val="7C4DDB"/>
-          <w:sz w:val="26"/>
-          <w:szCs w:val="26"/>
+          <w:color w:val="000000"/>
+          <w:sz w:val="28"/>
+          <w:szCs w:val="28"/>
           <w:rtl/>
         </w:rPr>
         <w:t xml:space="preserve">4) اكتشف الخطأ</w:t>
@@ -1402,16 +1389,15 @@
           <w:tcPr>
             <w:tcW w:type="dxa" w:w="10206"/>
             <w:tcBorders>
-              <w:top w:val="single" w:color="FFFFFF" w:sz="18"/>
+              <w:top w:val="none" w:color="FFFFFF" w:sz="0"/>
               <w:left w:val="none" w:color="FFFFFF" w:sz="0"/>
-              <w:bottom w:val="single" w:color="FFFFFF" w:sz="24"/>
+              <w:bottom w:val="single" w:color="BBBBBB" w:sz="4"/>
               <w:right w:val="none" w:color="FFFFFF" w:sz="0"/>
             </w:tcBorders>
-            <w:shd w:fill="F4F6FF" w:color="auto" w:val="clear"/>
             <w:tcMar>
-              <w:top w:type="dxa" w:w="40"/>
+              <w:top w:type="dxa" w:w="30"/>
               <w:left w:type="dxa" w:w="200"/>
-              <w:bottom w:type="dxa" w:w="40"/>
+              <w:bottom w:type="dxa" w:w="30"/>
               <w:right w:type="dxa" w:w="200"/>
             </w:tcMar>
           </w:tcPr>
@@ -1425,9 +1411,9 @@
                 <w:rFonts w:ascii="Arial" w:cs="Arial" w:hAnsi="Arial"/>
                 <w:b/>
                 <w:bCs/>
-                <w:color w:val="4C5FD5"/>
-                <w:sz w:val="23"/>
-                <w:szCs w:val="23"/>
+                <w:color w:val="000000"/>
+                <w:sz w:val="22"/>
+                <w:szCs w:val="22"/>
                 <w:rtl/>
               </w:rPr>
               <w:t xml:space="preserve">1:  </w:t>
@@ -1437,7 +1423,7 @@
                 <w:rFonts w:ascii="Arial" w:cs="Arial" w:hAnsi="Arial"/>
                 <w:b w:val="false"/>
                 <w:bCs w:val="false"/>
-                <w:color w:val="1B1F3B"/>
+                <w:color w:val="000000"/>
                 <w:sz w:val="22"/>
                 <w:szCs w:val="22"/>
                 <w:rtl/>
@@ -1484,16 +1470,15 @@
           <w:tcPr>
             <w:tcW w:type="dxa" w:w="10206"/>
             <w:tcBorders>
-              <w:top w:val="single" w:color="FFFFFF" w:sz="18"/>
+              <w:top w:val="none" w:color="FFFFFF" w:sz="0"/>
               <w:left w:val="none" w:color="FFFFFF" w:sz="0"/>
-              <w:bottom w:val="single" w:color="FFFFFF" w:sz="24"/>
+              <w:bottom w:val="single" w:color="BBBBBB" w:sz="4"/>
               <w:right w:val="none" w:color="FFFFFF" w:sz="0"/>
             </w:tcBorders>
-            <w:shd w:fill="F4F6FF" w:color="auto" w:val="clear"/>
             <w:tcMar>
-              <w:top w:type="dxa" w:w="40"/>
+              <w:top w:type="dxa" w:w="30"/>
               <w:left w:type="dxa" w:w="200"/>
-              <w:bottom w:type="dxa" w:w="40"/>
+              <w:bottom w:type="dxa" w:w="30"/>
               <w:right w:type="dxa" w:w="200"/>
             </w:tcMar>
           </w:tcPr>
@@ -1507,9 +1492,9 @@
                 <w:rFonts w:ascii="Arial" w:cs="Arial" w:hAnsi="Arial"/>
                 <w:b/>
                 <w:bCs/>
-                <w:color w:val="4C5FD5"/>
-                <w:sz w:val="23"/>
-                <w:szCs w:val="23"/>
+                <w:color w:val="000000"/>
+                <w:sz w:val="22"/>
+                <w:szCs w:val="22"/>
                 <w:rtl/>
               </w:rPr>
               <w:t xml:space="preserve">2:  </w:t>
@@ -1519,7 +1504,7 @@
                 <w:rFonts w:ascii="Arial" w:cs="Arial" w:hAnsi="Arial"/>
                 <w:b w:val="false"/>
                 <w:bCs w:val="false"/>
-                <w:color w:val="1B1F3B"/>
+                <w:color w:val="000000"/>
                 <w:sz w:val="22"/>
                 <w:szCs w:val="22"/>
                 <w:rtl/>
@@ -1557,16 +1542,15 @@
           <w:tcPr>
             <w:tcW w:type="dxa" w:w="10206"/>
             <w:tcBorders>
-              <w:top w:val="single" w:color="FFFFFF" w:sz="18"/>
+              <w:top w:val="none" w:color="FFFFFF" w:sz="0"/>
               <w:left w:val="none" w:color="FFFFFF" w:sz="0"/>
-              <w:bottom w:val="single" w:color="FFFFFF" w:sz="24"/>
+              <w:bottom w:val="single" w:color="BBBBBB" w:sz="4"/>
               <w:right w:val="none" w:color="FFFFFF" w:sz="0"/>
             </w:tcBorders>
-            <w:shd w:fill="F4F6FF" w:color="auto" w:val="clear"/>
             <w:tcMar>
-              <w:top w:type="dxa" w:w="40"/>
+              <w:top w:type="dxa" w:w="30"/>
               <w:left w:type="dxa" w:w="200"/>
-              <w:bottom w:type="dxa" w:w="40"/>
+              <w:bottom w:type="dxa" w:w="30"/>
               <w:right w:type="dxa" w:w="200"/>
             </w:tcMar>
           </w:tcPr>
@@ -1580,9 +1564,9 @@
                 <w:rFonts w:ascii="Arial" w:cs="Arial" w:hAnsi="Arial"/>
                 <w:b/>
                 <w:bCs/>
-                <w:color w:val="4C5FD5"/>
-                <w:sz w:val="23"/>
-                <w:szCs w:val="23"/>
+                <w:color w:val="000000"/>
+                <w:sz w:val="22"/>
+                <w:szCs w:val="22"/>
                 <w:rtl/>
               </w:rPr>
               <w:t xml:space="preserve">3:  </w:t>
@@ -1592,7 +1576,7 @@
                 <w:rFonts w:ascii="Arial" w:cs="Arial" w:hAnsi="Arial"/>
                 <w:b w:val="false"/>
                 <w:bCs w:val="false"/>
-                <w:color w:val="1B1F3B"/>
+                <w:color w:val="000000"/>
                 <w:sz w:val="22"/>
                 <w:szCs w:val="22"/>
                 <w:rtl/>
@@ -1633,7 +1617,7 @@
                 <w:rFonts w:ascii="Arial" w:cs="Arial" w:hAnsi="Arial"/>
                 <w:b w:val="false"/>
                 <w:bCs w:val="false"/>
-                <w:color w:val="1B1F3B"/>
+                <w:color w:val="000000"/>
                 <w:sz w:val="22"/>
                 <w:szCs w:val="22"/>
                 <w:rtl/>
@@ -1648,16 +1632,16 @@
       <w:pPr>
         <w:keepNext/>
         <w:bidi/>
-        <w:spacing w:after="30" w:before="70"/>
+        <w:spacing w:after="20" w:before="60"/>
       </w:pPr>
       <w:r>
         <w:rPr>
           <w:rFonts w:ascii="Arial" w:cs="Arial" w:hAnsi="Arial"/>
           <w:b/>
           <w:bCs/>
-          <w:color w:val="E8553A"/>
-          <w:sz w:val="26"/>
-          <w:szCs w:val="26"/>
+          <w:color w:val="000000"/>
+          <w:sz w:val="28"/>
+          <w:szCs w:val="28"/>
           <w:rtl/>
         </w:rPr>
         <w:t xml:space="preserve">5) أنت مؤلف المسألة</w:t>
@@ -1688,16 +1672,15 @@
           <w:tcPr>
             <w:tcW w:type="dxa" w:w="10206"/>
             <w:tcBorders>
-              <w:top w:val="single" w:color="FFFFFF" w:sz="18"/>
+              <w:top w:val="none" w:color="FFFFFF" w:sz="0"/>
               <w:left w:val="none" w:color="FFFFFF" w:sz="0"/>
-              <w:bottom w:val="single" w:color="FFFFFF" w:sz="24"/>
+              <w:bottom w:val="single" w:color="BBBBBB" w:sz="4"/>
               <w:right w:val="none" w:color="FFFFFF" w:sz="0"/>
             </w:tcBorders>
-            <w:shd w:fill="F4F6FF" w:color="auto" w:val="clear"/>
             <w:tcMar>
-              <w:top w:type="dxa" w:w="40"/>
+              <w:top w:type="dxa" w:w="30"/>
               <w:left w:type="dxa" w:w="200"/>
-              <w:bottom w:type="dxa" w:w="40"/>
+              <w:bottom w:type="dxa" w:w="30"/>
               <w:right w:type="dxa" w:w="200"/>
             </w:tcMar>
           </w:tcPr>
@@ -1711,9 +1694,9 @@
                 <w:rFonts w:ascii="Arial" w:cs="Arial" w:hAnsi="Arial"/>
                 <w:b/>
                 <w:bCs/>
-                <w:color w:val="4C5FD5"/>
-                <w:sz w:val="23"/>
-                <w:szCs w:val="23"/>
+                <w:color w:val="000000"/>
+                <w:sz w:val="22"/>
+                <w:szCs w:val="22"/>
                 <w:rtl/>
               </w:rPr>
               <w:t xml:space="preserve">1:  </w:t>
@@ -1723,7 +1706,7 @@
                 <w:rFonts w:ascii="Arial" w:cs="Arial" w:hAnsi="Arial"/>
                 <w:b w:val="false"/>
                 <w:bCs w:val="false"/>
-                <w:color w:val="1B1F3B"/>
+                <w:color w:val="000000"/>
                 <w:sz w:val="22"/>
                 <w:szCs w:val="22"/>
                 <w:rtl/>
@@ -1770,16 +1753,15 @@
           <w:tcPr>
             <w:tcW w:type="dxa" w:w="10206"/>
             <w:tcBorders>
-              <w:top w:val="single" w:color="FFFFFF" w:sz="18"/>
+              <w:top w:val="none" w:color="FFFFFF" w:sz="0"/>
               <w:left w:val="none" w:color="FFFFFF" w:sz="0"/>
-              <w:bottom w:val="single" w:color="FFFFFF" w:sz="24"/>
+              <w:bottom w:val="single" w:color="BBBBBB" w:sz="4"/>
               <w:right w:val="none" w:color="FFFFFF" w:sz="0"/>
             </w:tcBorders>
-            <w:shd w:fill="F4F6FF" w:color="auto" w:val="clear"/>
             <w:tcMar>
-              <w:top w:type="dxa" w:w="40"/>
+              <w:top w:type="dxa" w:w="30"/>
               <w:left w:type="dxa" w:w="200"/>
-              <w:bottom w:type="dxa" w:w="40"/>
+              <w:bottom w:type="dxa" w:w="30"/>
               <w:right w:type="dxa" w:w="200"/>
             </w:tcMar>
           </w:tcPr>
@@ -1793,9 +1775,9 @@
                 <w:rFonts w:ascii="Arial" w:cs="Arial" w:hAnsi="Arial"/>
                 <w:b/>
                 <w:bCs/>
-                <w:color w:val="4C5FD5"/>
-                <w:sz w:val="23"/>
-                <w:szCs w:val="23"/>
+                <w:color w:val="000000"/>
+                <w:sz w:val="22"/>
+                <w:szCs w:val="22"/>
                 <w:rtl/>
               </w:rPr>
               <w:t xml:space="preserve">2:  </w:t>
@@ -1805,7 +1787,7 @@
                 <w:rFonts w:ascii="Arial" w:cs="Arial" w:hAnsi="Arial"/>
                 <w:b w:val="false"/>
                 <w:bCs w:val="false"/>
-                <w:color w:val="1B1F3B"/>
+                <w:color w:val="000000"/>
                 <w:sz w:val="22"/>
                 <w:szCs w:val="22"/>
                 <w:rtl/>
@@ -1840,16 +1822,16 @@
       <w:pPr>
         <w:keepNext/>
         <w:bidi/>
-        <w:spacing w:after="30" w:before="70"/>
+        <w:spacing w:after="20" w:before="60"/>
       </w:pPr>
       <w:r>
         <w:rPr>
           <w:rFonts w:ascii="Arial" w:cs="Arial" w:hAnsi="Arial"/>
           <w:b/>
           <w:bCs/>
-          <w:color w:val="B07A00"/>
-          <w:sz w:val="26"/>
-          <w:szCs w:val="26"/>
+          <w:color w:val="000000"/>
+          <w:sz w:val="28"/>
+          <w:szCs w:val="28"/>
           <w:rtl/>
         </w:rPr>
         <w:t xml:space="preserve">تحدّي الإثراء</w:t>
@@ -1880,16 +1862,15 @@
           <w:tcPr>
             <w:tcW w:type="dxa" w:w="10206"/>
             <w:tcBorders>
-              <w:top w:val="single" w:color="FFFFFF" w:sz="18"/>
+              <w:top w:val="none" w:color="FFFFFF" w:sz="0"/>
               <w:left w:val="none" w:color="FFFFFF" w:sz="0"/>
-              <w:bottom w:val="single" w:color="FFFFFF" w:sz="24"/>
+              <w:bottom w:val="single" w:color="BBBBBB" w:sz="4"/>
               <w:right w:val="none" w:color="FFFFFF" w:sz="0"/>
             </w:tcBorders>
-            <w:shd w:fill="F4F6FF" w:color="auto" w:val="clear"/>
             <w:tcMar>
-              <w:top w:type="dxa" w:w="40"/>
+              <w:top w:type="dxa" w:w="30"/>
               <w:left w:type="dxa" w:w="200"/>
-              <w:bottom w:type="dxa" w:w="40"/>
+              <w:bottom w:type="dxa" w:w="30"/>
               <w:right w:type="dxa" w:w="200"/>
             </w:tcMar>
           </w:tcPr>
@@ -1903,9 +1884,9 @@
                 <w:rFonts w:ascii="Arial" w:cs="Arial" w:hAnsi="Arial"/>
                 <w:b/>
                 <w:bCs/>
-                <w:color w:val="4C5FD5"/>
-                <w:sz w:val="23"/>
-                <w:szCs w:val="23"/>
+                <w:color w:val="000000"/>
+                <w:sz w:val="22"/>
+                <w:szCs w:val="22"/>
                 <w:rtl/>
               </w:rPr>
               <w:t xml:space="preserve">الحل:  </w:t>
@@ -1977,7 +1958,7 @@
                 <w:rFonts w:ascii="Arial" w:cs="Arial" w:hAnsi="Arial"/>
                 <w:b w:val="false"/>
                 <w:bCs w:val="false"/>
-                <w:color w:val="1B1F3B"/>
+                <w:color w:val="000000"/>
                 <w:sz w:val="22"/>
                 <w:szCs w:val="22"/>
                 <w:rtl/>
@@ -1995,16 +1976,15 @@
           <w:tcPr>
             <w:tcW w:type="dxa" w:w="10206"/>
             <w:tcBorders>
-              <w:top w:val="single" w:color="FFFFFF" w:sz="18"/>
+              <w:top w:val="none" w:color="FFFFFF" w:sz="0"/>
               <w:left w:val="none" w:color="FFFFFF" w:sz="0"/>
-              <w:bottom w:val="single" w:color="FFFFFF" w:sz="24"/>
+              <w:bottom w:val="single" w:color="BBBBBB" w:sz="4"/>
               <w:right w:val="none" w:color="FFFFFF" w:sz="0"/>
             </w:tcBorders>
-            <w:shd w:fill="F4F6FF" w:color="auto" w:val="clear"/>
             <w:tcMar>
-              <w:top w:type="dxa" w:w="40"/>
+              <w:top w:type="dxa" w:w="30"/>
               <w:left w:type="dxa" w:w="200"/>
-              <w:bottom w:type="dxa" w:w="40"/>
+              <w:bottom w:type="dxa" w:w="30"/>
               <w:right w:type="dxa" w:w="200"/>
             </w:tcMar>
           </w:tcPr>
@@ -2018,9 +1998,9 @@
                 <w:rFonts w:ascii="Arial" w:cs="Arial" w:hAnsi="Arial"/>
                 <w:b/>
                 <w:bCs/>
-                <w:color w:val="4C5FD5"/>
-                <w:sz w:val="23"/>
-                <w:szCs w:val="23"/>
+                <w:color w:val="000000"/>
+                <w:sz w:val="22"/>
+                <w:szCs w:val="22"/>
                 <w:rtl/>
               </w:rPr>
               <w:t xml:space="preserve">التفكير:  </w:t>
@@ -2030,7 +2010,7 @@
                 <w:rFonts w:ascii="Arial" w:cs="Arial" w:hAnsi="Arial"/>
                 <w:b w:val="false"/>
                 <w:bCs w:val="false"/>
-                <w:color w:val="1B1F3B"/>
+                <w:color w:val="000000"/>
                 <w:sz w:val="22"/>
                 <w:szCs w:val="22"/>
                 <w:rtl/>
@@ -2062,7 +2042,7 @@
                 <w:rFonts w:ascii="Arial" w:cs="Arial" w:hAnsi="Arial"/>
                 <w:b w:val="false"/>
                 <w:bCs w:val="false"/>
-                <w:color w:val="1B1F3B"/>
+                <w:color w:val="000000"/>
                 <w:sz w:val="22"/>
                 <w:szCs w:val="22"/>
                 <w:rtl/>
@@ -2310,8 +2290,9 @@
     <w:rPrDefault>
       <w:rPr>
         <w:rFonts w:ascii="Arial" w:cs="Arial" w:hAnsi="Arial"/>
-        <w:sz w:val="23"/>
-        <w:szCs w:val="23"/>
+        <w:color w:val="000000"/>
+        <w:sz w:val="28"/>
+        <w:szCs w:val="28"/>
         <w:rtl/>
       </w:rPr>
     </w:rPrDefault>

</xml_diff>